<commit_message>
Update Oradio3 modules - wifi.docx
</commit_message>
<xml_diff>
--- a/Documents/Control/Oradio3 modules - wifi.docx
+++ b/Documents/Control/Oradio3 modules - wifi.docx
@@ -1053,7 +1053,13 @@
     <w:p>
       <w:commentRangeStart w:id="6"/>
       <w:r>
-        <w:t>Wifi service allows multiple client to register to receive wifi status messages</w:t>
+        <w:t>Wifi service allows multiple client</w:t>
+      </w:r>
+      <w:r>
+        <w:t>s</w:t>
+      </w:r>
+      <w:r>
+        <w:t xml:space="preserve"> to register to receive wifi status messages</w:t>
       </w:r>
       <w:commentRangeEnd w:id="6"/>
       <w:r>
@@ -1169,15 +1175,18 @@
       <w:pPr>
         <w:pStyle w:val="Kop3"/>
       </w:pPr>
-      <w:bookmarkStart w:id="11" w:name="_Toc228868872"/>
-      <w:r>
-        <w:t>Get</w:t>
+      <w:bookmarkStart w:id="11" w:name="_Toc228868873"/>
+      <w:r>
+        <w:t xml:space="preserve">Event: </w:t>
+      </w:r>
+      <w:r>
+        <w:t>Wifi</w:t>
       </w:r>
       <w:r>
         <w:t xml:space="preserve"> </w:t>
       </w:r>
       <w:r>
-        <w:t>state</w:t>
+        <w:t>connect</w:t>
       </w:r>
       <w:bookmarkEnd w:id="11"/>
     </w:p>
@@ -1192,37 +1201,8 @@
         <w:ind w:left="709" w:hanging="284"/>
       </w:pPr>
       <w:r>
-        <w:t xml:space="preserve">Return wifi state: idle | access point | </w:t>
-      </w:r>
-      <w:commentRangeStart w:id="12"/>
-      <w:r>
-        <w:t>connected</w:t>
-      </w:r>
-      <w:commentRangeEnd w:id="12"/>
-      <w:r>
-        <w:rPr>
-          <w:rStyle w:val="Verwijzingopmerking"/>
-          <w:sz w:val="22"/>
-          <w:szCs w:val="22"/>
-        </w:rPr>
-        <w:commentReference w:id="12"/>
-      </w:r>
-    </w:p>
-    <w:p>
-      <w:pPr>
-        <w:pStyle w:val="Kop3"/>
-      </w:pPr>
-      <w:bookmarkStart w:id="13" w:name="_Toc228868873"/>
-      <w:r>
-        <w:t>Wifi</w:t>
-      </w:r>
-      <w:r>
-        <w:t xml:space="preserve"> </w:t>
-      </w:r>
-      <w:r>
-        <w:t>connect</w:t>
-      </w:r>
-      <w:bookmarkEnd w:id="13"/>
+        <w:t>Remember current wifi connection</w:t>
+      </w:r>
     </w:p>
     <w:p>
       <w:pPr>
@@ -1234,8 +1214,30 @@
         <w:suppressAutoHyphens/>
         <w:ind w:left="709" w:hanging="284"/>
       </w:pPr>
-      <w:r>
-        <w:t>Remember current wifi connection</w:t>
+      <w:commentRangeStart w:id="12"/>
+      <w:r>
+        <w:t xml:space="preserve">Add or </w:t>
+      </w:r>
+      <w:r>
+        <w:t>replace</w:t>
+      </w:r>
+      <w:r>
+        <w:t xml:space="preserve"> </w:t>
+      </w:r>
+      <w:commentRangeEnd w:id="12"/>
+      <w:r>
+        <w:rPr>
+          <w:rStyle w:val="Verwijzingopmerking"/>
+          <w:sz w:val="22"/>
+          <w:szCs w:val="22"/>
+        </w:rPr>
+        <w:commentReference w:id="12"/>
+      </w:r>
+      <w:r>
+        <w:t xml:space="preserve">wifi network credentials </w:t>
+      </w:r>
+      <w:r>
+        <w:t>In LNMS</w:t>
       </w:r>
     </w:p>
     <w:p>
@@ -1248,15 +1250,82 @@
         <w:suppressAutoHyphens/>
         <w:ind w:left="709" w:hanging="284"/>
       </w:pPr>
+      <w:r>
+        <w:t>C</w:t>
+      </w:r>
+      <w:r>
+        <w:t>onnect to wifi network</w:t>
+      </w:r>
+    </w:p>
+    <w:p>
+      <w:pPr>
+        <w:pStyle w:val="Kop4"/>
+      </w:pPr>
+      <w:r>
+        <w:t>If connect</w:t>
+      </w:r>
+      <w:r>
+        <w:t>ed</w:t>
+      </w:r>
+    </w:p>
+    <w:p>
+      <w:pPr>
+        <w:pStyle w:val="Lijstalinea"/>
+        <w:numPr>
+          <w:ilvl w:val="0"/>
+          <w:numId w:val="15"/>
+        </w:numPr>
+        <w:suppressAutoHyphens/>
+        <w:ind w:left="993" w:hanging="284"/>
+      </w:pPr>
+      <w:r>
+        <w:t xml:space="preserve">Send </w:t>
+      </w:r>
+      <w:r>
+        <w:t>wifi</w:t>
+      </w:r>
+      <w:r>
+        <w:t xml:space="preserve"> (access point | connected) </w:t>
+      </w:r>
+      <w:r>
+        <w:t xml:space="preserve">message to </w:t>
+      </w:r>
+      <w:commentRangeStart w:id="13"/>
+      <w:r>
+        <w:t>registered clients</w:t>
+      </w:r>
+      <w:commentRangeEnd w:id="13"/>
+      <w:r>
+        <w:rPr>
+          <w:rStyle w:val="Verwijzingopmerking"/>
+          <w:sz w:val="22"/>
+          <w:szCs w:val="22"/>
+        </w:rPr>
+        <w:commentReference w:id="13"/>
+      </w:r>
+    </w:p>
+    <w:p>
+      <w:pPr>
+        <w:pStyle w:val="Kop4"/>
+      </w:pPr>
+      <w:r>
+        <w:lastRenderedPageBreak/>
+        <w:t>If fail to connect</w:t>
+      </w:r>
+    </w:p>
+    <w:p>
+      <w:pPr>
+        <w:pStyle w:val="Lijstalinea"/>
+        <w:numPr>
+          <w:ilvl w:val="0"/>
+          <w:numId w:val="15"/>
+        </w:numPr>
+        <w:suppressAutoHyphens/>
+        <w:ind w:left="993" w:hanging="284"/>
+      </w:pPr>
       <w:commentRangeStart w:id="14"/>
       <w:r>
-        <w:t xml:space="preserve">Add or </w:t>
-      </w:r>
-      <w:r>
-        <w:t>replace</w:t>
-      </w:r>
-      <w:r>
-        <w:t xml:space="preserve"> </w:t>
+        <w:t xml:space="preserve">Remove </w:t>
       </w:r>
       <w:commentRangeEnd w:id="14"/>
       <w:r>
@@ -1268,11 +1337,149 @@
         <w:commentReference w:id="14"/>
       </w:r>
       <w:r>
-        <w:t xml:space="preserve">wifi network credentials </w:t>
-      </w:r>
-      <w:r>
-        <w:t>In LNMS</w:t>
-      </w:r>
+        <w:t>wifi network credentials</w:t>
+      </w:r>
+    </w:p>
+    <w:p>
+      <w:pPr>
+        <w:pStyle w:val="Lijstalinea"/>
+        <w:numPr>
+          <w:ilvl w:val="0"/>
+          <w:numId w:val="15"/>
+        </w:numPr>
+        <w:suppressAutoHyphens/>
+        <w:ind w:left="993" w:hanging="284"/>
+      </w:pPr>
+      <w:r>
+        <w:t xml:space="preserve">Send </w:t>
+      </w:r>
+      <w:r>
+        <w:t xml:space="preserve">wifi </w:t>
+      </w:r>
+      <w:r>
+        <w:t xml:space="preserve">failed to connect </w:t>
+      </w:r>
+      <w:r>
+        <w:t xml:space="preserve">message to </w:t>
+      </w:r>
+      <w:commentRangeStart w:id="15"/>
+      <w:r>
+        <w:t>registered clients</w:t>
+      </w:r>
+      <w:commentRangeEnd w:id="15"/>
+      <w:r>
+        <w:rPr>
+          <w:rStyle w:val="Verwijzingopmerking"/>
+          <w:sz w:val="22"/>
+          <w:szCs w:val="22"/>
+        </w:rPr>
+        <w:commentReference w:id="15"/>
+      </w:r>
+    </w:p>
+    <w:p>
+      <w:pPr>
+        <w:pStyle w:val="Kop3"/>
+      </w:pPr>
+      <w:bookmarkStart w:id="16" w:name="_Toc228868874"/>
+      <w:r>
+        <w:t xml:space="preserve">Event: </w:t>
+      </w:r>
+      <w:r>
+        <w:t>Wifi disconnect</w:t>
+      </w:r>
+      <w:bookmarkEnd w:id="16"/>
+    </w:p>
+    <w:p>
+      <w:pPr>
+        <w:pStyle w:val="Kop4"/>
+      </w:pPr>
+      <w:r>
+        <w:t>If connected</w:t>
+      </w:r>
+    </w:p>
+    <w:p>
+      <w:pPr>
+        <w:pStyle w:val="Lijstalinea"/>
+        <w:numPr>
+          <w:ilvl w:val="0"/>
+          <w:numId w:val="15"/>
+        </w:numPr>
+        <w:suppressAutoHyphens/>
+        <w:ind w:left="993" w:hanging="284"/>
+      </w:pPr>
+      <w:commentRangeStart w:id="17"/>
+      <w:r>
+        <w:t xml:space="preserve">Disconnect </w:t>
+      </w:r>
+      <w:commentRangeEnd w:id="17"/>
+      <w:r>
+        <w:rPr>
+          <w:rStyle w:val="Verwijzingopmerking"/>
+          <w:sz w:val="22"/>
+          <w:szCs w:val="22"/>
+        </w:rPr>
+        <w:commentReference w:id="17"/>
+      </w:r>
+      <w:r>
+        <w:t xml:space="preserve">from </w:t>
+      </w:r>
+      <w:commentRangeStart w:id="18"/>
+      <w:r>
+        <w:t>wifi network</w:t>
+      </w:r>
+      <w:commentRangeEnd w:id="18"/>
+      <w:r>
+        <w:rPr>
+          <w:rStyle w:val="Verwijzingopmerking"/>
+          <w:sz w:val="22"/>
+          <w:szCs w:val="22"/>
+        </w:rPr>
+        <w:commentReference w:id="18"/>
+      </w:r>
+    </w:p>
+    <w:p>
+      <w:pPr>
+        <w:pStyle w:val="Lijstalinea"/>
+        <w:numPr>
+          <w:ilvl w:val="0"/>
+          <w:numId w:val="15"/>
+        </w:numPr>
+        <w:suppressAutoHyphens/>
+        <w:ind w:left="993" w:hanging="284"/>
+      </w:pPr>
+      <w:bookmarkStart w:id="19" w:name="_Toc228868875"/>
+      <w:r>
+        <w:t xml:space="preserve">Send </w:t>
+      </w:r>
+      <w:r>
+        <w:t>wifi disconnected</w:t>
+      </w:r>
+      <w:r>
+        <w:t xml:space="preserve"> message to </w:t>
+      </w:r>
+      <w:commentRangeStart w:id="20"/>
+      <w:r>
+        <w:t>registered clients</w:t>
+      </w:r>
+      <w:commentRangeEnd w:id="20"/>
+      <w:r>
+        <w:rPr>
+          <w:rStyle w:val="Verwijzingopmerking"/>
+          <w:sz w:val="22"/>
+          <w:szCs w:val="22"/>
+        </w:rPr>
+        <w:commentReference w:id="20"/>
+      </w:r>
+    </w:p>
+    <w:p>
+      <w:pPr>
+        <w:pStyle w:val="Kop3"/>
+      </w:pPr>
+      <w:bookmarkStart w:id="21" w:name="_Toc228868872"/>
+      <w:r>
+        <w:t>Get state</w:t>
+      </w:r>
+      <w:bookmarkEnd w:id="21"/>
     </w:p>
     <w:p>
       <w:pPr>
@@ -1285,111 +1492,26 @@
         <w:ind w:left="709" w:hanging="284"/>
       </w:pPr>
       <w:r>
-        <w:t>C</w:t>
-      </w:r>
-      <w:r>
-        <w:t>onnect to wifi network</w:t>
-      </w:r>
-    </w:p>
-    <w:p>
-      <w:pPr>
-        <w:pStyle w:val="Kop4"/>
-      </w:pPr>
-      <w:r>
-        <w:lastRenderedPageBreak/>
-        <w:t>If fail to connect</w:t>
-      </w:r>
-    </w:p>
-    <w:p>
-      <w:pPr>
-        <w:pStyle w:val="Lijstalinea"/>
-        <w:numPr>
-          <w:ilvl w:val="0"/>
-          <w:numId w:val="15"/>
-        </w:numPr>
-        <w:suppressAutoHyphens/>
-        <w:ind w:left="993" w:hanging="284"/>
-      </w:pPr>
-      <w:commentRangeStart w:id="15"/>
-      <w:r>
-        <w:t xml:space="preserve">Remove </w:t>
-      </w:r>
-      <w:commentRangeEnd w:id="15"/>
+        <w:t xml:space="preserve">Return wifi state: idle | access point | </w:t>
+      </w:r>
+      <w:commentRangeStart w:id="22"/>
+      <w:r>
+        <w:t>connected</w:t>
+      </w:r>
+      <w:commentRangeEnd w:id="22"/>
       <w:r>
         <w:rPr>
           <w:rStyle w:val="Verwijzingopmerking"/>
           <w:sz w:val="22"/>
           <w:szCs w:val="22"/>
         </w:rPr>
-        <w:commentReference w:id="15"/>
-      </w:r>
-      <w:r>
-        <w:t>wifi network credentials</w:t>
+        <w:commentReference w:id="22"/>
       </w:r>
     </w:p>
     <w:p>
       <w:pPr>
         <w:pStyle w:val="Kop3"/>
       </w:pPr>
-      <w:bookmarkStart w:id="16" w:name="_Toc228868874"/>
-      <w:r>
-        <w:t>Wifi disconnect</w:t>
-      </w:r>
-      <w:bookmarkEnd w:id="16"/>
-    </w:p>
-    <w:p>
-      <w:pPr>
-        <w:pStyle w:val="Kop4"/>
-      </w:pPr>
-      <w:r>
-        <w:t>If connected</w:t>
-      </w:r>
-    </w:p>
-    <w:p>
-      <w:pPr>
-        <w:pStyle w:val="Lijstalinea"/>
-        <w:numPr>
-          <w:ilvl w:val="0"/>
-          <w:numId w:val="15"/>
-        </w:numPr>
-        <w:suppressAutoHyphens/>
-        <w:ind w:left="993" w:hanging="284"/>
-      </w:pPr>
-      <w:commentRangeStart w:id="17"/>
-      <w:r>
-        <w:t xml:space="preserve">Disconnect </w:t>
-      </w:r>
-      <w:commentRangeEnd w:id="17"/>
-      <w:r>
-        <w:rPr>
-          <w:rStyle w:val="Verwijzingopmerking"/>
-          <w:sz w:val="22"/>
-          <w:szCs w:val="22"/>
-        </w:rPr>
-        <w:commentReference w:id="17"/>
-      </w:r>
-      <w:r>
-        <w:t xml:space="preserve">from </w:t>
-      </w:r>
-      <w:commentRangeStart w:id="18"/>
-      <w:r>
-        <w:t>wifi network</w:t>
-      </w:r>
-      <w:commentRangeEnd w:id="18"/>
-      <w:r>
-        <w:rPr>
-          <w:rStyle w:val="Verwijzingopmerking"/>
-          <w:sz w:val="22"/>
-          <w:szCs w:val="22"/>
-        </w:rPr>
-        <w:commentReference w:id="18"/>
-      </w:r>
-    </w:p>
-    <w:p>
-      <w:pPr>
-        <w:pStyle w:val="Kop3"/>
-      </w:pPr>
-      <w:bookmarkStart w:id="19" w:name="_Toc228868875"/>
       <w:r>
         <w:t>Get wifi networks</w:t>
       </w:r>
@@ -1405,18 +1527,18 @@
         <w:suppressAutoHyphens/>
         <w:ind w:left="709" w:hanging="284"/>
       </w:pPr>
-      <w:commentRangeStart w:id="20"/>
+      <w:commentRangeStart w:id="23"/>
       <w:r>
         <w:t xml:space="preserve">Return </w:t>
       </w:r>
-      <w:commentRangeEnd w:id="20"/>
+      <w:commentRangeEnd w:id="23"/>
       <w:r>
         <w:rPr>
           <w:rStyle w:val="Verwijzingopmerking"/>
           <w:sz w:val="22"/>
           <w:szCs w:val="22"/>
         </w:rPr>
-        <w:commentReference w:id="20"/>
+        <w:commentReference w:id="23"/>
       </w:r>
       <w:r>
         <w:t>list of on-air wifi network SSIDs, empty if none</w:t>
@@ -1440,11 +1562,11 @@
       <w:pPr>
         <w:pStyle w:val="Kop3"/>
       </w:pPr>
-      <w:bookmarkStart w:id="21" w:name="_Toc228868876"/>
+      <w:bookmarkStart w:id="24" w:name="_Toc228868876"/>
       <w:r>
         <w:t>Get wifi connection</w:t>
       </w:r>
-      <w:bookmarkEnd w:id="21"/>
+      <w:bookmarkEnd w:id="24"/>
     </w:p>
     <w:p>
       <w:pPr>
@@ -1456,18 +1578,18 @@
         <w:suppressAutoHyphens/>
         <w:ind w:left="709" w:hanging="284"/>
       </w:pPr>
-      <w:commentRangeStart w:id="22"/>
+      <w:commentRangeStart w:id="25"/>
       <w:r>
         <w:t xml:space="preserve">Return </w:t>
       </w:r>
-      <w:commentRangeEnd w:id="22"/>
+      <w:commentRangeEnd w:id="25"/>
       <w:r>
         <w:rPr>
           <w:rStyle w:val="Verwijzingopmerking"/>
           <w:sz w:val="22"/>
           <w:szCs w:val="22"/>
         </w:rPr>
-        <w:commentReference w:id="22"/>
+        <w:commentReference w:id="25"/>
       </w:r>
       <w:r>
         <w:t>SSID of connected wifi network, None if not connected</w:t>
@@ -1477,20 +1599,20 @@
       <w:pPr>
         <w:pStyle w:val="Kop3"/>
       </w:pPr>
-      <w:bookmarkStart w:id="23" w:name="_Toc228868877"/>
-      <w:commentRangeStart w:id="24"/>
+      <w:bookmarkStart w:id="26" w:name="_Toc228868877"/>
+      <w:commentRangeStart w:id="27"/>
       <w:r>
         <w:t>NetworkManager add</w:t>
       </w:r>
-      <w:bookmarkEnd w:id="23"/>
-      <w:commentRangeEnd w:id="24"/>
+      <w:bookmarkEnd w:id="26"/>
+      <w:commentRangeEnd w:id="27"/>
       <w:r>
         <w:rPr>
           <w:rStyle w:val="Verwijzingopmerking"/>
           <w:sz w:val="32"/>
           <w:szCs w:val="28"/>
         </w:rPr>
-        <w:commentReference w:id="24"/>
+        <w:commentReference w:id="27"/>
       </w:r>
     </w:p>
     <w:p>
@@ -1554,7 +1676,7 @@
         <w:annotationRef/>
       </w:r>
       <w:r>
-        <w:t>Er wordt een LMNS wrapper gebruikt. Fouten worden gelogd en wrapper geeft False terug. De aanroepende functie weet dus alleen dat de call mislukt is, niet wat er mislukt is</w:t>
+        <w:t>Er wordt een LNMS wrapper gebruikt. Fouten worden gelogd en wrapper geeft False terug. De aanroepende functie weet dus alleen dat de call mislukt is, niet wat er mislukt is</w:t>
       </w:r>
     </w:p>
   </w:comment>
@@ -1570,7 +1692,7 @@
         <w:annotationRef/>
       </w:r>
       <w:r>
-        <w:t>Wat is de status als er een fout is? Welke fouten zijn te herstellen? En hoe doe je dat dan? En wat doe je als het niet herstelbaar is?</w:t>
+        <w:t>Wat is de status als er een fout is?</w:t>
       </w:r>
     </w:p>
   </w:comment>
@@ -1586,7 +1708,7 @@
         <w:annotationRef/>
       </w:r>
       <w:r>
-        <w:t>Geen timeout voor als LMNS later alsnog beschikbaar komt</w:t>
+        <w:t>Geen timeout voor als LNMS later alsnog beschikbaar komt</w:t>
       </w:r>
     </w:p>
   </w:comment>
@@ -1602,7 +1724,7 @@
         <w:annotationRef/>
       </w:r>
       <w:r>
-        <w:t>Een niet (meer) bestaande client wordt niet gedetecteerd</w:t>
+        <w:t>Een niet (meer) bestaande client wordt alleen gelogd</w:t>
       </w:r>
     </w:p>
   </w:comment>
@@ -1622,7 +1744,7 @@
       </w:r>
     </w:p>
   </w:comment>
-  <w:comment w:id="12" w:author="Onno Janssen" w:date="2026-05-05T09:03:00Z" w:initials="OJ">
+  <w:comment w:id="12" w:author="Onno Janssen" w:date="2026-05-05T09:58:00Z" w:initials="OJ">
     <w:p>
       <w:pPr>
         <w:pStyle w:val="Tekstopmerking"/>
@@ -1634,11 +1756,11 @@
         <w:annotationRef/>
       </w:r>
       <w:r>
-        <w:t>Connected betekent alleen dat er een wifi verbinding is NIET dat er internet is</w:t>
+        <w:t>Als mislukt krijgen clients wifi_fail_config bericht</w:t>
       </w:r>
     </w:p>
   </w:comment>
-  <w:comment w:id="14" w:author="Onno Janssen" w:date="2026-05-05T09:58:00Z" w:initials="OJ">
+  <w:comment w:id="13" w:author="Onno Janssen" w:date="2026-05-05T09:47:00Z" w:initials="OJ">
     <w:p>
       <w:pPr>
         <w:pStyle w:val="Tekstopmerking"/>
@@ -1650,11 +1772,11 @@
         <w:annotationRef/>
       </w:r>
       <w:r>
-        <w:t>Als mislukt krijgen clients wifi_fail_config bericht</w:t>
+        <w:t>Een niet (meer) bestaande client wordt alleen gelogd</w:t>
       </w:r>
     </w:p>
   </w:comment>
-  <w:comment w:id="15" w:author="Onno Janssen" w:date="2026-05-05T10:00:00Z" w:initials="OJ">
+  <w:comment w:id="14" w:author="Onno Janssen" w:date="2026-05-05T10:00:00Z" w:initials="OJ">
     <w:p>
       <w:pPr>
         <w:pStyle w:val="Tekstopmerking"/>
@@ -1667,6 +1789,22 @@
       </w:r>
       <w:r>
         <w:t>Fail wordt alleen gelogd</w:t>
+      </w:r>
+    </w:p>
+  </w:comment>
+  <w:comment w:id="15" w:author="Onno Janssen" w:date="2026-05-05T09:47:00Z" w:initials="OJ">
+    <w:p>
+      <w:pPr>
+        <w:pStyle w:val="Tekstopmerking"/>
+      </w:pPr>
+      <w:r>
+        <w:rPr>
+          <w:rStyle w:val="Verwijzingopmerking"/>
+        </w:rPr>
+        <w:annotationRef/>
+      </w:r>
+      <w:r>
+        <w:t>Een niet (meer) bestaande client wordt alleen gelogd</w:t>
       </w:r>
     </w:p>
   </w:comment>
@@ -1709,7 +1847,7 @@
       </w:r>
     </w:p>
   </w:comment>
-  <w:comment w:id="20" w:author="Onno Janssen" w:date="2026-05-05T10:01:00Z" w:initials="OJ">
+  <w:comment w:id="20" w:author="Onno Janssen" w:date="2026-05-05T09:47:00Z" w:initials="OJ">
     <w:p>
       <w:pPr>
         <w:pStyle w:val="Tekstopmerking"/>
@@ -1721,11 +1859,11 @@
         <w:annotationRef/>
       </w:r>
       <w:r>
-        <w:t>Fail wordt alleen gelogd, dus onduidelijk on None echt leeg is of een fail</w:t>
+        <w:t>Een niet (meer) bestaande client wordt alleen gelogd</w:t>
       </w:r>
     </w:p>
   </w:comment>
-  <w:comment w:id="22" w:author="Onno Janssen" w:date="2026-05-05T10:02:00Z" w:initials="OJ">
+  <w:comment w:id="22" w:author="Onno Janssen" w:date="2026-05-05T09:03:00Z" w:initials="OJ">
     <w:p>
       <w:pPr>
         <w:pStyle w:val="Tekstopmerking"/>
@@ -1737,11 +1875,43 @@
         <w:annotationRef/>
       </w:r>
       <w:r>
+        <w:t>Connected betekent alleen dat er een wifi verbinding is NIET dat er internet is</w:t>
+      </w:r>
+    </w:p>
+  </w:comment>
+  <w:comment w:id="23" w:author="Onno Janssen" w:date="2026-05-05T10:01:00Z" w:initials="OJ">
+    <w:p>
+      <w:pPr>
+        <w:pStyle w:val="Tekstopmerking"/>
+      </w:pPr>
+      <w:r>
+        <w:rPr>
+          <w:rStyle w:val="Verwijzingopmerking"/>
+        </w:rPr>
+        <w:annotationRef/>
+      </w:r>
+      <w:r>
+        <w:t>Fail wordt alleen gelogd, dus onduidelijk on None echt leeg is of een fail</w:t>
+      </w:r>
+    </w:p>
+  </w:comment>
+  <w:comment w:id="25" w:author="Onno Janssen" w:date="2026-05-05T10:02:00Z" w:initials="OJ">
+    <w:p>
+      <w:pPr>
+        <w:pStyle w:val="Tekstopmerking"/>
+      </w:pPr>
+      <w:r>
+        <w:rPr>
+          <w:rStyle w:val="Verwijzingopmerking"/>
+        </w:rPr>
+        <w:annotationRef/>
+      </w:r>
+      <w:r>
         <w:t>Fail wordt alleen gelogd</w:t>
       </w:r>
     </w:p>
   </w:comment>
-  <w:comment w:id="24" w:author="Onno Janssen" w:date="2026-05-05T10:19:00Z" w:initials="OJ">
+  <w:comment w:id="27" w:author="Onno Janssen" w:date="2026-05-05T10:19:00Z" w:initials="OJ">
     <w:p>
       <w:pPr>
         <w:pStyle w:val="Tekstopmerking"/>
@@ -1767,11 +1937,14 @@
   <w15:commentEx w15:paraId="0B56DB94" w15:done="0"/>
   <w15:commentEx w15:paraId="64D3970F" w15:done="0"/>
   <w15:commentEx w15:paraId="2EC5A9B0" w15:done="0"/>
-  <w15:commentEx w15:paraId="495A37F1" w15:done="0"/>
   <w15:commentEx w15:paraId="7CDE1FBC" w15:done="0"/>
+  <w15:commentEx w15:paraId="5B138A7D" w15:done="0"/>
   <w15:commentEx w15:paraId="658F63CF" w15:done="0"/>
+  <w15:commentEx w15:paraId="199581D4" w15:done="0"/>
   <w15:commentEx w15:paraId="64FA4578" w15:done="0"/>
   <w15:commentEx w15:paraId="70FC9ED3" w15:done="0"/>
+  <w15:commentEx w15:paraId="780A7B74" w15:done="0"/>
+  <w15:commentEx w15:paraId="0A0B8D79" w15:done="0"/>
   <w15:commentEx w15:paraId="19256630" w15:done="0"/>
   <w15:commentEx w15:paraId="59AE1DA8" w15:done="0"/>
   <w15:commentEx w15:paraId="513A9695" w15:done="0"/>
@@ -1785,11 +1958,14 @@
   <w16cex:commentExtensible w16cex:durableId="0C207118" w16cex:dateUtc="2026-05-05T06:56:00Z"/>
   <w16cex:commentExtensible w16cex:durableId="33120C64" w16cex:dateUtc="2026-05-05T07:47:00Z"/>
   <w16cex:commentExtensible w16cex:durableId="06B9579D" w16cex:dateUtc="2026-05-05T07:52:00Z"/>
-  <w16cex:commentExtensible w16cex:durableId="75554338" w16cex:dateUtc="2026-05-05T07:03:00Z"/>
   <w16cex:commentExtensible w16cex:durableId="3BD015EA" w16cex:dateUtc="2026-05-05T07:58:00Z"/>
+  <w16cex:commentExtensible w16cex:durableId="3D0C0CCF" w16cex:dateUtc="2026-05-05T07:47:00Z"/>
   <w16cex:commentExtensible w16cex:durableId="0C246DDD" w16cex:dateUtc="2026-05-05T08:00:00Z"/>
+  <w16cex:commentExtensible w16cex:durableId="54A9780F" w16cex:dateUtc="2026-05-05T07:47:00Z"/>
   <w16cex:commentExtensible w16cex:durableId="4CF27818" w16cex:dateUtc="2026-05-05T08:00:00Z"/>
   <w16cex:commentExtensible w16cex:durableId="4B43A685" w16cex:dateUtc="2026-05-05T08:13:00Z"/>
+  <w16cex:commentExtensible w16cex:durableId="172500DE" w16cex:dateUtc="2026-05-05T07:47:00Z"/>
+  <w16cex:commentExtensible w16cex:durableId="75554338" w16cex:dateUtc="2026-05-05T07:03:00Z"/>
   <w16cex:commentExtensible w16cex:durableId="054573B3" w16cex:dateUtc="2026-05-05T08:01:00Z"/>
   <w16cex:commentExtensible w16cex:durableId="18AFF652" w16cex:dateUtc="2026-05-05T08:02:00Z"/>
   <w16cex:commentExtensible w16cex:durableId="2D57D799" w16cex:dateUtc="2026-05-05T08:19:00Z"/>
@@ -1803,11 +1979,14 @@
   <w16cid:commentId w16cid:paraId="0B56DB94" w16cid:durableId="0C207118"/>
   <w16cid:commentId w16cid:paraId="64D3970F" w16cid:durableId="33120C64"/>
   <w16cid:commentId w16cid:paraId="2EC5A9B0" w16cid:durableId="06B9579D"/>
-  <w16cid:commentId w16cid:paraId="495A37F1" w16cid:durableId="75554338"/>
   <w16cid:commentId w16cid:paraId="7CDE1FBC" w16cid:durableId="3BD015EA"/>
+  <w16cid:commentId w16cid:paraId="5B138A7D" w16cid:durableId="3D0C0CCF"/>
   <w16cid:commentId w16cid:paraId="658F63CF" w16cid:durableId="0C246DDD"/>
+  <w16cid:commentId w16cid:paraId="199581D4" w16cid:durableId="54A9780F"/>
   <w16cid:commentId w16cid:paraId="64FA4578" w16cid:durableId="4CF27818"/>
   <w16cid:commentId w16cid:paraId="70FC9ED3" w16cid:durableId="4B43A685"/>
+  <w16cid:commentId w16cid:paraId="780A7B74" w16cid:durableId="172500DE"/>
+  <w16cid:commentId w16cid:paraId="0A0B8D79" w16cid:durableId="75554338"/>
   <w16cid:commentId w16cid:paraId="19256630" w16cid:durableId="054573B3"/>
   <w16cid:commentId w16cid:paraId="59AE1DA8" w16cid:durableId="18AFF652"/>
   <w16cid:commentId w16cid:paraId="513A9695" w16cid:durableId="2D57D799"/>

</xml_diff>